<commit_message>
feat: add Daily Collection report and update core modules
- Add DailyCollection.jsx page

- Update api.js

- Refine AssessmentPreview and ClientTransactions UI

- Minor updates to App.jsx, Sidebar.jsx, and others
</commit_message>
<xml_diff>
--- a/reference/PLENRO_ORDINANCE.docx
+++ b/reference/PLENRO_ORDINANCE.docx
@@ -16677,31 +16677,7 @@
         <w:rPr>
           <w:b/>
         </w:rPr>
-        <w:t>INDUSTRIAL</w:t>
-      </w:r>
-      <w:r>
-        <w:rPr>
-          <w:b/>
-        </w:rPr>
-        <w:t xml:space="preserve"> (ISAG)</w:t>
-      </w:r>
-      <w:r>
-        <w:rPr>
-          <w:b/>
-        </w:rPr>
-        <w:t xml:space="preserve"> AND COMMERCIAL</w:t>
-      </w:r>
-      <w:r>
-        <w:rPr>
-          <w:b/>
-        </w:rPr>
-        <w:t xml:space="preserve"> (CSAG)</w:t>
-      </w:r>
-      <w:r>
-        <w:rPr>
-          <w:b/>
-        </w:rPr>
-        <w:t xml:space="preserve"> SAND AND GRAVEL </w:t>
+        <w:t xml:space="preserve">INDUSTRIAL (ISAG) AND COMMERCIAL (CSAG) SAND AND GRAVEL </w:t>
       </w:r>
       <w:proofErr w:type="gramStart"/>
       <w:r>
@@ -19538,13 +19514,7 @@
         <w:rPr>
           <w:b/>
         </w:rPr>
-        <w:t xml:space="preserve"> PERMIT</w:t>
-      </w:r>
-      <w:r>
-        <w:rPr>
-          <w:b/>
-        </w:rPr>
-        <w:t xml:space="preserve"> (QP)</w:t>
+        <w:t xml:space="preserve"> PERMIT (QP)</w:t>
       </w:r>
       <w:r>
         <w:rPr>
@@ -23843,6 +23813,2430 @@
           <w:rFonts w:ascii="Arial" w:hAnsi="Arial" w:cs="Arial"/>
         </w:rPr>
       </w:pPr>
+    </w:p>
+    <w:p>
+      <w:pPr>
+        <w:spacing w:after="0"/>
+        <w:rPr>
+          <w:rFonts w:ascii="Arial" w:hAnsi="Arial" w:cs="Arial"/>
+        </w:rPr>
+      </w:pPr>
+    </w:p>
+    <w:p>
+      <w:pPr>
+        <w:spacing w:after="0"/>
+        <w:rPr>
+          <w:rFonts w:ascii="Arial" w:hAnsi="Arial" w:cs="Arial"/>
+        </w:rPr>
+      </w:pPr>
+      <w:r>
+        <w:rPr>
+          <w:rFonts w:ascii="Arial" w:hAnsi="Arial" w:cs="Arial"/>
+        </w:rPr>
+        <w:t># LGU Laws and Regulations: Mining and Natural Resources</w:t>
+      </w:r>
+    </w:p>
+    <w:p>
+      <w:pPr>
+        <w:spacing w:after="0"/>
+        <w:rPr>
+          <w:rFonts w:ascii="Arial" w:hAnsi="Arial" w:cs="Arial"/>
+        </w:rPr>
+      </w:pPr>
+      <w:r>
+        <w:rPr>
+          <w:rFonts w:ascii="Arial" w:hAnsi="Arial" w:cs="Arial"/>
+        </w:rPr>
+        <w:t>## Compiled Reference for Local Government Unit Concerns</w:t>
+      </w:r>
+    </w:p>
+    <w:p>
+      <w:pPr>
+        <w:spacing w:after="0"/>
+        <w:rPr>
+          <w:rFonts w:ascii="Arial" w:hAnsi="Arial" w:cs="Arial"/>
+        </w:rPr>
+      </w:pPr>
+    </w:p>
+    <w:p>
+      <w:pPr>
+        <w:spacing w:after="0"/>
+        <w:rPr>
+          <w:rFonts w:ascii="Arial" w:hAnsi="Arial" w:cs="Arial"/>
+        </w:rPr>
+      </w:pPr>
+      <w:r>
+        <w:rPr>
+          <w:rFonts w:ascii="Arial" w:hAnsi="Arial" w:cs="Arial"/>
+        </w:rPr>
+        <w:t xml:space="preserve">*Based on Republic Act No. 7942 (Philippine Mining Act of 1995), DENR Administrative Order (DAO) No. 96-40 (Implementing Rules and Regulations), and DAO No. 2004-54 (SDMP </w:t>
+      </w:r>
+      <w:r>
+        <w:rPr>
+          <w:rFonts w:ascii="Arial" w:hAnsi="Arial" w:cs="Arial"/>
+        </w:rPr>
+        <w:t>amendments) *</w:t>
+      </w:r>
+    </w:p>
+    <w:p>
+      <w:pPr>
+        <w:spacing w:after="0"/>
+        <w:rPr>
+          <w:rFonts w:ascii="Arial" w:hAnsi="Arial" w:cs="Arial"/>
+        </w:rPr>
+      </w:pPr>
+    </w:p>
+    <w:p>
+      <w:pPr>
+        <w:spacing w:after="0"/>
+        <w:rPr>
+          <w:rFonts w:ascii="Arial" w:hAnsi="Arial" w:cs="Arial"/>
+        </w:rPr>
+      </w:pPr>
+      <w:r>
+        <w:rPr>
+          <w:rFonts w:ascii="Arial" w:hAnsi="Arial" w:cs="Arial"/>
+        </w:rPr>
+        <w:t>---</w:t>
+      </w:r>
+    </w:p>
+    <w:p>
+      <w:pPr>
+        <w:spacing w:after="0"/>
+        <w:rPr>
+          <w:rFonts w:ascii="Arial" w:hAnsi="Arial" w:cs="Arial"/>
+        </w:rPr>
+      </w:pPr>
+    </w:p>
+    <w:p>
+      <w:pPr>
+        <w:spacing w:after="0"/>
+        <w:rPr>
+          <w:rFonts w:ascii="Arial" w:hAnsi="Arial" w:cs="Arial"/>
+        </w:rPr>
+      </w:pPr>
+      <w:r>
+        <w:rPr>
+          <w:rFonts w:ascii="Arial" w:hAnsi="Arial" w:cs="Arial"/>
+        </w:rPr>
+        <w:t>## Overview</w:t>
+      </w:r>
+    </w:p>
+    <w:p>
+      <w:pPr>
+        <w:spacing w:after="0"/>
+        <w:rPr>
+          <w:rFonts w:ascii="Arial" w:hAnsi="Arial" w:cs="Arial"/>
+        </w:rPr>
+      </w:pPr>
+    </w:p>
+    <w:p>
+      <w:pPr>
+        <w:spacing w:after="0"/>
+        <w:rPr>
+          <w:rFonts w:ascii="Arial" w:hAnsi="Arial" w:cs="Arial"/>
+        </w:rPr>
+      </w:pPr>
+      <w:r>
+        <w:rPr>
+          <w:rFonts w:ascii="Arial" w:hAnsi="Arial" w:cs="Arial"/>
+        </w:rPr>
+        <w:t>This document compiles provisions from Philippine mining laws that specifically concern Local Government Units (LGUs), including powers, responsibilities, and rights granted to Provincial Governors, City Mayors, and municipal/city/provincial LGUs.</w:t>
+      </w:r>
+    </w:p>
+    <w:p>
+      <w:pPr>
+        <w:spacing w:after="0"/>
+        <w:rPr>
+          <w:rFonts w:ascii="Arial" w:hAnsi="Arial" w:cs="Arial"/>
+        </w:rPr>
+      </w:pPr>
+    </w:p>
+    <w:p>
+      <w:pPr>
+        <w:spacing w:after="0"/>
+        <w:rPr>
+          <w:rFonts w:ascii="Arial" w:hAnsi="Arial" w:cs="Arial"/>
+        </w:rPr>
+      </w:pPr>
+      <w:r>
+        <w:rPr>
+          <w:rFonts w:ascii="Arial" w:hAnsi="Arial" w:cs="Arial"/>
+        </w:rPr>
+        <w:t>---</w:t>
+      </w:r>
+    </w:p>
+    <w:p>
+      <w:pPr>
+        <w:spacing w:after="0"/>
+        <w:rPr>
+          <w:rFonts w:ascii="Arial" w:hAnsi="Arial" w:cs="Arial"/>
+        </w:rPr>
+      </w:pPr>
+    </w:p>
+    <w:p>
+      <w:pPr>
+        <w:spacing w:after="0"/>
+        <w:rPr>
+          <w:rFonts w:ascii="Arial" w:hAnsi="Arial" w:cs="Arial"/>
+        </w:rPr>
+      </w:pPr>
+      <w:r>
+        <w:rPr>
+          <w:rFonts w:ascii="Arial" w:hAnsi="Arial" w:cs="Arial"/>
+        </w:rPr>
+        <w:t>## I. LGU Authority and Powers</w:t>
+      </w:r>
+    </w:p>
+    <w:p>
+      <w:pPr>
+        <w:spacing w:after="0"/>
+        <w:rPr>
+          <w:rFonts w:ascii="Arial" w:hAnsi="Arial" w:cs="Arial"/>
+        </w:rPr>
+      </w:pPr>
+    </w:p>
+    <w:p>
+      <w:pPr>
+        <w:spacing w:after="0"/>
+        <w:rPr>
+          <w:rFonts w:ascii="Arial" w:hAnsi="Arial" w:cs="Arial"/>
+        </w:rPr>
+      </w:pPr>
+      <w:r>
+        <w:rPr>
+          <w:rFonts w:ascii="Arial" w:hAnsi="Arial" w:cs="Arial"/>
+        </w:rPr>
+        <w:t>### A. Provincial Governor's Permitting Authority</w:t>
+      </w:r>
+    </w:p>
+    <w:p>
+      <w:pPr>
+        <w:spacing w:after="0"/>
+        <w:rPr>
+          <w:rFonts w:ascii="Arial" w:hAnsi="Arial" w:cs="Arial"/>
+        </w:rPr>
+      </w:pPr>
+    </w:p>
+    <w:p>
+      <w:pPr>
+        <w:spacing w:after="0"/>
+        <w:rPr>
+          <w:rFonts w:ascii="Arial" w:hAnsi="Arial" w:cs="Arial"/>
+        </w:rPr>
+      </w:pPr>
+      <w:r>
+        <w:rPr>
+          <w:rFonts w:ascii="Arial" w:hAnsi="Arial" w:cs="Arial"/>
+        </w:rPr>
+        <w:t>The Provincial Governor has direct authority to grant the following permits (generally in coordination with DENR/MGB and subject to existing mining rights):</w:t>
+      </w:r>
+    </w:p>
+    <w:p>
+      <w:pPr>
+        <w:spacing w:after="0"/>
+        <w:rPr>
+          <w:rFonts w:ascii="Arial" w:hAnsi="Arial" w:cs="Arial"/>
+        </w:rPr>
+      </w:pPr>
+    </w:p>
+    <w:p>
+      <w:pPr>
+        <w:spacing w:after="0"/>
+        <w:rPr>
+          <w:rFonts w:ascii="Arial" w:hAnsi="Arial" w:cs="Arial"/>
+        </w:rPr>
+      </w:pPr>
+      <w:r>
+        <w:rPr>
+          <w:rFonts w:ascii="Arial" w:hAnsi="Arial" w:cs="Arial"/>
+        </w:rPr>
+        <w:t>#### 1. Quarry Permit (RA 7942 Sec. 43; DAO 96-40)</w:t>
+      </w:r>
+    </w:p>
+    <w:p>
+      <w:pPr>
+        <w:spacing w:after="0"/>
+        <w:rPr>
+          <w:rFonts w:ascii="Arial" w:hAnsi="Arial" w:cs="Arial"/>
+        </w:rPr>
+      </w:pPr>
+      <w:r>
+        <w:rPr>
+          <w:rFonts w:ascii="Arial" w:hAnsi="Arial" w:cs="Arial"/>
+        </w:rPr>
+        <w:t>- **Authority**: Provincial/City Mining Regulatory Board (PMRB), permit granted by Provincial Governor</w:t>
+      </w:r>
+    </w:p>
+    <w:p>
+      <w:pPr>
+        <w:spacing w:after="0"/>
+        <w:rPr>
+          <w:rFonts w:ascii="Arial" w:hAnsi="Arial" w:cs="Arial"/>
+        </w:rPr>
+      </w:pPr>
+      <w:r>
+        <w:rPr>
+          <w:rFonts w:ascii="Arial" w:hAnsi="Arial" w:cs="Arial"/>
+        </w:rPr>
+        <w:t>- **Scope**: Quarrying on private and/or public lands for building and construction materials</w:t>
+      </w:r>
+    </w:p>
+    <w:p>
+      <w:pPr>
+        <w:spacing w:after="0"/>
+        <w:rPr>
+          <w:rFonts w:ascii="Arial" w:hAnsi="Arial" w:cs="Arial"/>
+        </w:rPr>
+      </w:pPr>
+      <w:r>
+        <w:rPr>
+          <w:rFonts w:ascii="Arial" w:hAnsi="Arial" w:cs="Arial"/>
+        </w:rPr>
+        <w:t>- **Maximum Area**: 5 hectares per qualified person at any one time</w:t>
+      </w:r>
+    </w:p>
+    <w:p>
+      <w:pPr>
+        <w:spacing w:after="0"/>
+        <w:rPr>
+          <w:rFonts w:ascii="Arial" w:hAnsi="Arial" w:cs="Arial"/>
+        </w:rPr>
+      </w:pPr>
+      <w:r>
+        <w:rPr>
+          <w:rFonts w:ascii="Arial" w:hAnsi="Arial" w:cs="Arial"/>
+        </w:rPr>
+        <w:t>- **Term**: 5 years, renewable, but not to exceed 25 years total</w:t>
+      </w:r>
+    </w:p>
+    <w:p>
+      <w:pPr>
+        <w:spacing w:after="0"/>
+        <w:rPr>
+          <w:rFonts w:ascii="Arial" w:hAnsi="Arial" w:cs="Arial"/>
+        </w:rPr>
+      </w:pPr>
+      <w:r>
+        <w:rPr>
+          <w:rFonts w:ascii="Arial" w:hAnsi="Arial" w:cs="Arial"/>
+        </w:rPr>
+        <w:t>- **Limitation**: No quarry permit in an area covered by a mineral agreement or FTAA</w:t>
+      </w:r>
+    </w:p>
+    <w:p>
+      <w:pPr>
+        <w:spacing w:after="0"/>
+        <w:rPr>
+          <w:rFonts w:ascii="Arial" w:hAnsi="Arial" w:cs="Arial"/>
+        </w:rPr>
+      </w:pPr>
+    </w:p>
+    <w:p>
+      <w:pPr>
+        <w:spacing w:after="0"/>
+        <w:rPr>
+          <w:rFonts w:ascii="Arial" w:hAnsi="Arial" w:cs="Arial"/>
+        </w:rPr>
+      </w:pPr>
+      <w:r>
+        <w:rPr>
+          <w:rFonts w:ascii="Arial" w:hAnsi="Arial" w:cs="Arial"/>
+        </w:rPr>
+        <w:t>#### 2. Commercial Sand and Gravel Permit (RA 7942 Sec. 46; DAO 96-40)</w:t>
+      </w:r>
+    </w:p>
+    <w:p>
+      <w:pPr>
+        <w:spacing w:after="0"/>
+        <w:rPr>
+          <w:rFonts w:ascii="Arial" w:hAnsi="Arial" w:cs="Arial"/>
+        </w:rPr>
+      </w:pPr>
+      <w:r>
+        <w:rPr>
+          <w:rFonts w:ascii="Arial" w:hAnsi="Arial" w:cs="Arial"/>
+        </w:rPr>
+        <w:t>- **Authority**: Provincial Governor</w:t>
+      </w:r>
+    </w:p>
+    <w:p>
+      <w:pPr>
+        <w:spacing w:after="0"/>
+        <w:rPr>
+          <w:rFonts w:ascii="Arial" w:hAnsi="Arial" w:cs="Arial"/>
+        </w:rPr>
+      </w:pPr>
+      <w:r>
+        <w:rPr>
+          <w:rFonts w:ascii="Arial" w:hAnsi="Arial" w:cs="Arial"/>
+        </w:rPr>
+        <w:t>- **Purpose**: Extract/remove sand, gravel, and other loose/unconsolidated materials used in their natural state (no processing)</w:t>
+      </w:r>
+    </w:p>
+    <w:p>
+      <w:pPr>
+        <w:spacing w:after="0"/>
+        <w:rPr>
+          <w:rFonts w:ascii="Arial" w:hAnsi="Arial" w:cs="Arial"/>
+        </w:rPr>
+      </w:pPr>
+      <w:r>
+        <w:rPr>
+          <w:rFonts w:ascii="Arial" w:hAnsi="Arial" w:cs="Arial"/>
+        </w:rPr>
+        <w:t>- **Maximum Area**: Not more than 5 hectares</w:t>
+      </w:r>
+    </w:p>
+    <w:p>
+      <w:pPr>
+        <w:spacing w:after="0"/>
+        <w:rPr>
+          <w:rFonts w:ascii="Arial" w:hAnsi="Arial" w:cs="Arial"/>
+        </w:rPr>
+      </w:pPr>
+      <w:r>
+        <w:rPr>
+          <w:rFonts w:ascii="Arial" w:hAnsi="Arial" w:cs="Arial"/>
+        </w:rPr>
+        <w:t>- **Term**: 1 year, renewable for like periods</w:t>
+      </w:r>
+    </w:p>
+    <w:p>
+      <w:pPr>
+        <w:spacing w:after="0"/>
+        <w:rPr>
+          <w:rFonts w:ascii="Arial" w:hAnsi="Arial" w:cs="Arial"/>
+        </w:rPr>
+      </w:pPr>
+      <w:r>
+        <w:rPr>
+          <w:rFonts w:ascii="Arial" w:hAnsi="Arial" w:cs="Arial"/>
+        </w:rPr>
+        <w:t>- **Limitation**: Only 1 permit per qualified person in a municipality at any one time</w:t>
+      </w:r>
+    </w:p>
+    <w:p>
+      <w:pPr>
+        <w:spacing w:after="0"/>
+        <w:rPr>
+          <w:rFonts w:ascii="Arial" w:hAnsi="Arial" w:cs="Arial"/>
+        </w:rPr>
+      </w:pPr>
+    </w:p>
+    <w:p>
+      <w:pPr>
+        <w:spacing w:after="0"/>
+        <w:rPr>
+          <w:rFonts w:ascii="Arial" w:hAnsi="Arial" w:cs="Arial"/>
+        </w:rPr>
+      </w:pPr>
+      <w:r>
+        <w:rPr>
+          <w:rFonts w:ascii="Arial" w:hAnsi="Arial" w:cs="Arial"/>
+        </w:rPr>
+        <w:t>#### 3. Industrial Sand and Gravel Permit (RA 7942 Sec. 47)</w:t>
+      </w:r>
+    </w:p>
+    <w:p>
+      <w:pPr>
+        <w:spacing w:after="0"/>
+        <w:rPr>
+          <w:rFonts w:ascii="Arial" w:hAnsi="Arial" w:cs="Arial"/>
+        </w:rPr>
+      </w:pPr>
+      <w:r>
+        <w:rPr>
+          <w:rFonts w:ascii="Arial" w:hAnsi="Arial" w:cs="Arial"/>
+        </w:rPr>
+        <w:t>- **Authority**: Bureau (for areas over 5 hectares)</w:t>
+      </w:r>
+    </w:p>
+    <w:p>
+      <w:pPr>
+        <w:spacing w:after="0"/>
+        <w:rPr>
+          <w:rFonts w:ascii="Arial" w:hAnsi="Arial" w:cs="Arial"/>
+        </w:rPr>
+      </w:pPr>
+      <w:r>
+        <w:rPr>
+          <w:rFonts w:ascii="Arial" w:hAnsi="Arial" w:cs="Arial"/>
+        </w:rPr>
+        <w:t>- **Purpose**: Extraction that requires mechanical processing</w:t>
+      </w:r>
+    </w:p>
+    <w:p>
+      <w:pPr>
+        <w:spacing w:after="0"/>
+        <w:rPr>
+          <w:rFonts w:ascii="Arial" w:hAnsi="Arial" w:cs="Arial"/>
+        </w:rPr>
+      </w:pPr>
+      <w:r>
+        <w:rPr>
+          <w:rFonts w:ascii="Arial" w:hAnsi="Arial" w:cs="Arial"/>
+        </w:rPr>
+        <w:t>- **Term**: 5 years, renewable, but not to exceed 25 years total</w:t>
+      </w:r>
+    </w:p>
+    <w:p>
+      <w:pPr>
+        <w:spacing w:after="0"/>
+        <w:rPr>
+          <w:rFonts w:ascii="Arial" w:hAnsi="Arial" w:cs="Arial"/>
+        </w:rPr>
+      </w:pPr>
+      <w:r>
+        <w:rPr>
+          <w:rFonts w:ascii="Arial" w:hAnsi="Arial" w:cs="Arial"/>
+        </w:rPr>
+        <w:t>- **Note**: DAO 96-40 provides that LGUs may approve ISG permits not exceeding 5 hectares in coordination with DENR offices.</w:t>
+      </w:r>
+    </w:p>
+    <w:p>
+      <w:pPr>
+        <w:spacing w:after="0"/>
+        <w:rPr>
+          <w:rFonts w:ascii="Arial" w:hAnsi="Arial" w:cs="Arial"/>
+        </w:rPr>
+      </w:pPr>
+    </w:p>
+    <w:p>
+      <w:pPr>
+        <w:spacing w:after="0"/>
+        <w:rPr>
+          <w:rFonts w:ascii="Arial" w:hAnsi="Arial" w:cs="Arial"/>
+        </w:rPr>
+      </w:pPr>
+      <w:r>
+        <w:rPr>
+          <w:rFonts w:ascii="Arial" w:hAnsi="Arial" w:cs="Arial"/>
+        </w:rPr>
+        <w:t>#### 4. Exclusive Sand and Gravel Permit (RA 7942 Sec. 48; DAO 96-40)</w:t>
+      </w:r>
+    </w:p>
+    <w:p>
+      <w:pPr>
+        <w:spacing w:after="0"/>
+        <w:rPr>
+          <w:rFonts w:ascii="Arial" w:hAnsi="Arial" w:cs="Arial"/>
+        </w:rPr>
+      </w:pPr>
+      <w:r>
+        <w:rPr>
+          <w:rFonts w:ascii="Arial" w:hAnsi="Arial" w:cs="Arial"/>
+        </w:rPr>
+        <w:t>- **Authority**: Provincial Governor</w:t>
+      </w:r>
+    </w:p>
+    <w:p>
+      <w:pPr>
+        <w:spacing w:after="0"/>
+        <w:rPr>
+          <w:rFonts w:ascii="Arial" w:hAnsi="Arial" w:cs="Arial"/>
+        </w:rPr>
+      </w:pPr>
+      <w:r>
+        <w:rPr>
+          <w:rFonts w:ascii="Arial" w:hAnsi="Arial" w:cs="Arial"/>
+        </w:rPr>
+        <w:t>- **Purpose**: Quarry/utilize sand and gravel from public lands for the permittee’s own use (no commercial disposition)</w:t>
+      </w:r>
+    </w:p>
+    <w:p>
+      <w:pPr>
+        <w:spacing w:after="0"/>
+        <w:rPr>
+          <w:rFonts w:ascii="Arial" w:hAnsi="Arial" w:cs="Arial"/>
+        </w:rPr>
+      </w:pPr>
+      <w:r>
+        <w:rPr>
+          <w:rFonts w:ascii="Arial" w:hAnsi="Arial" w:cs="Arial"/>
+        </w:rPr>
+        <w:t>- **Term**: 60 days, non-renewable</w:t>
+      </w:r>
+    </w:p>
+    <w:p>
+      <w:pPr>
+        <w:spacing w:after="0"/>
+        <w:rPr>
+          <w:rFonts w:ascii="Arial" w:hAnsi="Arial" w:cs="Arial"/>
+        </w:rPr>
+      </w:pPr>
+    </w:p>
+    <w:p>
+      <w:pPr>
+        <w:spacing w:after="0"/>
+        <w:rPr>
+          <w:rFonts w:ascii="Arial" w:hAnsi="Arial" w:cs="Arial"/>
+        </w:rPr>
+      </w:pPr>
+      <w:r>
+        <w:rPr>
+          <w:rFonts w:ascii="Arial" w:hAnsi="Arial" w:cs="Arial"/>
+        </w:rPr>
+        <w:t>#### 5. Government Gratuitous Permit (RA 7942 Sec. 49)</w:t>
+      </w:r>
+    </w:p>
+    <w:p>
+      <w:pPr>
+        <w:spacing w:after="0"/>
+        <w:rPr>
+          <w:rFonts w:ascii="Arial" w:hAnsi="Arial" w:cs="Arial"/>
+        </w:rPr>
+      </w:pPr>
+      <w:r>
+        <w:rPr>
+          <w:rFonts w:ascii="Arial" w:hAnsi="Arial" w:cs="Arial"/>
+        </w:rPr>
+        <w:t>- **Authority**: Provincial Governor</w:t>
+      </w:r>
+    </w:p>
+    <w:p>
+      <w:pPr>
+        <w:spacing w:after="0"/>
+        <w:rPr>
+          <w:rFonts w:ascii="Arial" w:hAnsi="Arial" w:cs="Arial"/>
+        </w:rPr>
+      </w:pPr>
+      <w:r>
+        <w:rPr>
+          <w:rFonts w:ascii="Arial" w:hAnsi="Arial" w:cs="Arial"/>
+        </w:rPr>
+        <w:t>- **Purpose**: Materials for public infrastructure/buildings for public use</w:t>
+      </w:r>
+    </w:p>
+    <w:p>
+      <w:pPr>
+        <w:spacing w:after="0"/>
+        <w:rPr>
+          <w:rFonts w:ascii="Arial" w:hAnsi="Arial" w:cs="Arial"/>
+        </w:rPr>
+      </w:pPr>
+      <w:r>
+        <w:rPr>
+          <w:rFonts w:ascii="Arial" w:hAnsi="Arial" w:cs="Arial"/>
+        </w:rPr>
+        <w:t>- **Maximum Area**: Not more than 2 hectares</w:t>
+      </w:r>
+    </w:p>
+    <w:p>
+      <w:pPr>
+        <w:spacing w:after="0"/>
+        <w:rPr>
+          <w:rFonts w:ascii="Arial" w:hAnsi="Arial" w:cs="Arial"/>
+        </w:rPr>
+      </w:pPr>
+      <w:r>
+        <w:rPr>
+          <w:rFonts w:ascii="Arial" w:hAnsi="Arial" w:cs="Arial"/>
+        </w:rPr>
+        <w:t>- **Term**: Coterminous with construction</w:t>
+      </w:r>
+    </w:p>
+    <w:p>
+      <w:pPr>
+        <w:spacing w:after="0"/>
+        <w:rPr>
+          <w:rFonts w:ascii="Arial" w:hAnsi="Arial" w:cs="Arial"/>
+        </w:rPr>
+      </w:pPr>
+    </w:p>
+    <w:p>
+      <w:pPr>
+        <w:spacing w:after="0"/>
+        <w:rPr>
+          <w:rFonts w:ascii="Arial" w:hAnsi="Arial" w:cs="Arial"/>
+        </w:rPr>
+      </w:pPr>
+      <w:r>
+        <w:rPr>
+          <w:rFonts w:ascii="Arial" w:hAnsi="Arial" w:cs="Arial"/>
+        </w:rPr>
+        <w:t>#### 6. Private Gratuitous Permit (RA 7942 Sec. 50)</w:t>
+      </w:r>
+    </w:p>
+    <w:p>
+      <w:pPr>
+        <w:spacing w:after="0"/>
+        <w:rPr>
+          <w:rFonts w:ascii="Arial" w:hAnsi="Arial" w:cs="Arial"/>
+        </w:rPr>
+      </w:pPr>
+      <w:r>
+        <w:rPr>
+          <w:rFonts w:ascii="Arial" w:hAnsi="Arial" w:cs="Arial"/>
+        </w:rPr>
+        <w:t>- **Authority**: Provincial Governor</w:t>
+      </w:r>
+    </w:p>
+    <w:p>
+      <w:pPr>
+        <w:spacing w:after="0"/>
+        <w:rPr>
+          <w:rFonts w:ascii="Arial" w:hAnsi="Arial" w:cs="Arial"/>
+        </w:rPr>
+      </w:pPr>
+      <w:r>
+        <w:rPr>
+          <w:rFonts w:ascii="Arial" w:hAnsi="Arial" w:cs="Arial"/>
+        </w:rPr>
+        <w:t>- **Grantee**: Owner of land</w:t>
+      </w:r>
+    </w:p>
+    <w:p>
+      <w:pPr>
+        <w:spacing w:after="0"/>
+        <w:rPr>
+          <w:rFonts w:ascii="Arial" w:hAnsi="Arial" w:cs="Arial"/>
+        </w:rPr>
+      </w:pPr>
+    </w:p>
+    <w:p>
+      <w:pPr>
+        <w:spacing w:after="0"/>
+        <w:rPr>
+          <w:rFonts w:ascii="Arial" w:hAnsi="Arial" w:cs="Arial"/>
+        </w:rPr>
+      </w:pPr>
+      <w:r>
+        <w:rPr>
+          <w:rFonts w:ascii="Arial" w:hAnsi="Arial" w:cs="Arial"/>
+        </w:rPr>
+        <w:t>#### 7. Guano Permit (RA 7942 Sec. 51)</w:t>
+      </w:r>
+    </w:p>
+    <w:p>
+      <w:pPr>
+        <w:spacing w:after="0"/>
+        <w:rPr>
+          <w:rFonts w:ascii="Arial" w:hAnsi="Arial" w:cs="Arial"/>
+        </w:rPr>
+      </w:pPr>
+      <w:r>
+        <w:rPr>
+          <w:rFonts w:ascii="Arial" w:hAnsi="Arial" w:cs="Arial"/>
+        </w:rPr>
+        <w:t>- **Authority**: Provincial Governor</w:t>
+      </w:r>
+    </w:p>
+    <w:p>
+      <w:pPr>
+        <w:spacing w:after="0"/>
+        <w:rPr>
+          <w:rFonts w:ascii="Arial" w:hAnsi="Arial" w:cs="Arial"/>
+        </w:rPr>
+      </w:pPr>
+      <w:r>
+        <w:rPr>
+          <w:rFonts w:ascii="Arial" w:hAnsi="Arial" w:cs="Arial"/>
+        </w:rPr>
+        <w:t>- **Purpose**: Extract/utilize guano and other organic fertilizer materials from verified cave/confined sites</w:t>
+      </w:r>
+    </w:p>
+    <w:p>
+      <w:pPr>
+        <w:spacing w:after="0"/>
+        <w:rPr>
+          <w:rFonts w:ascii="Arial" w:hAnsi="Arial" w:cs="Arial"/>
+        </w:rPr>
+      </w:pPr>
+    </w:p>
+    <w:p>
+      <w:pPr>
+        <w:spacing w:after="0"/>
+        <w:rPr>
+          <w:rFonts w:ascii="Arial" w:hAnsi="Arial" w:cs="Arial"/>
+        </w:rPr>
+      </w:pPr>
+      <w:r>
+        <w:rPr>
+          <w:rFonts w:ascii="Arial" w:hAnsi="Arial" w:cs="Arial"/>
+        </w:rPr>
+        <w:t>#### 8. Gemstone Gathering Permit (RA 7942 Sec. 52)</w:t>
+      </w:r>
+    </w:p>
+    <w:p>
+      <w:pPr>
+        <w:spacing w:after="0"/>
+        <w:rPr>
+          <w:rFonts w:ascii="Arial" w:hAnsi="Arial" w:cs="Arial"/>
+        </w:rPr>
+      </w:pPr>
+      <w:r>
+        <w:rPr>
+          <w:rFonts w:ascii="Arial" w:hAnsi="Arial" w:cs="Arial"/>
+        </w:rPr>
+        <w:t>- **Authority**: Provincial Governor</w:t>
+      </w:r>
+    </w:p>
+    <w:p>
+      <w:pPr>
+        <w:spacing w:after="0"/>
+        <w:rPr>
+          <w:rFonts w:ascii="Arial" w:hAnsi="Arial" w:cs="Arial"/>
+        </w:rPr>
+      </w:pPr>
+      <w:r>
+        <w:rPr>
+          <w:rFonts w:ascii="Arial" w:hAnsi="Arial" w:cs="Arial"/>
+        </w:rPr>
+        <w:t>- **Type**: Non-exclusive</w:t>
+      </w:r>
+    </w:p>
+    <w:p>
+      <w:pPr>
+        <w:spacing w:after="0"/>
+        <w:rPr>
+          <w:rFonts w:ascii="Arial" w:hAnsi="Arial" w:cs="Arial"/>
+        </w:rPr>
+      </w:pPr>
+      <w:r>
+        <w:rPr>
+          <w:rFonts w:ascii="Arial" w:hAnsi="Arial" w:cs="Arial"/>
+        </w:rPr>
+        <w:t>- **Purpose**: Gather loose stones useful as gemstones in rivers and other locations</w:t>
+      </w:r>
+    </w:p>
+    <w:p>
+      <w:pPr>
+        <w:spacing w:after="0"/>
+        <w:rPr>
+          <w:rFonts w:ascii="Arial" w:hAnsi="Arial" w:cs="Arial"/>
+        </w:rPr>
+      </w:pPr>
+    </w:p>
+    <w:p>
+      <w:pPr>
+        <w:spacing w:after="0"/>
+        <w:rPr>
+          <w:rFonts w:ascii="Arial" w:hAnsi="Arial" w:cs="Arial"/>
+        </w:rPr>
+      </w:pPr>
+      <w:r>
+        <w:rPr>
+          <w:rFonts w:ascii="Arial" w:hAnsi="Arial" w:cs="Arial"/>
+        </w:rPr>
+        <w:t>### B. Provincial/City Mining Regulatory Board (PMRB)</w:t>
+      </w:r>
+    </w:p>
+    <w:p>
+      <w:pPr>
+        <w:spacing w:after="0"/>
+        <w:rPr>
+          <w:rFonts w:ascii="Arial" w:hAnsi="Arial" w:cs="Arial"/>
+        </w:rPr>
+      </w:pPr>
+    </w:p>
+    <w:p>
+      <w:pPr>
+        <w:spacing w:after="0"/>
+        <w:rPr>
+          <w:rFonts w:ascii="Arial" w:hAnsi="Arial" w:cs="Arial"/>
+        </w:rPr>
+      </w:pPr>
+      <w:r>
+        <w:rPr>
+          <w:rFonts w:ascii="Arial" w:hAnsi="Arial" w:cs="Arial"/>
+        </w:rPr>
+        <w:t>- Receives/handles quarry-related applications and supports provincial permitting.</w:t>
+      </w:r>
+    </w:p>
+    <w:p>
+      <w:pPr>
+        <w:spacing w:after="0"/>
+        <w:rPr>
+          <w:rFonts w:ascii="Arial" w:hAnsi="Arial" w:cs="Arial"/>
+        </w:rPr>
+      </w:pPr>
+      <w:r>
+        <w:rPr>
+          <w:rFonts w:ascii="Arial" w:hAnsi="Arial" w:cs="Arial"/>
+        </w:rPr>
+        <w:t>- For small-scale mining ores transported to custom mills/processing plants, PMRB formulates transport policies (RA 7942 Sec. 53).</w:t>
+      </w:r>
+    </w:p>
+    <w:p>
+      <w:pPr>
+        <w:spacing w:after="0"/>
+        <w:rPr>
+          <w:rFonts w:ascii="Arial" w:hAnsi="Arial" w:cs="Arial"/>
+        </w:rPr>
+      </w:pPr>
+    </w:p>
+    <w:p>
+      <w:pPr>
+        <w:spacing w:after="0"/>
+        <w:rPr>
+          <w:rFonts w:ascii="Arial" w:hAnsi="Arial" w:cs="Arial"/>
+        </w:rPr>
+      </w:pPr>
+      <w:r>
+        <w:rPr>
+          <w:rFonts w:ascii="Arial" w:hAnsi="Arial" w:cs="Arial"/>
+        </w:rPr>
+        <w:t>---</w:t>
+      </w:r>
+    </w:p>
+    <w:p>
+      <w:pPr>
+        <w:spacing w:after="0"/>
+        <w:rPr>
+          <w:rFonts w:ascii="Arial" w:hAnsi="Arial" w:cs="Arial"/>
+        </w:rPr>
+      </w:pPr>
+    </w:p>
+    <w:p>
+      <w:pPr>
+        <w:spacing w:after="0"/>
+        <w:rPr>
+          <w:rFonts w:ascii="Arial" w:hAnsi="Arial" w:cs="Arial"/>
+        </w:rPr>
+      </w:pPr>
+      <w:r>
+        <w:rPr>
+          <w:rFonts w:ascii="Arial" w:hAnsi="Arial" w:cs="Arial"/>
+        </w:rPr>
+        <w:t>## II. LGU Roles (DAO 96-40)</w:t>
+      </w:r>
+    </w:p>
+    <w:p>
+      <w:pPr>
+        <w:spacing w:after="0"/>
+        <w:rPr>
+          <w:rFonts w:ascii="Arial" w:hAnsi="Arial" w:cs="Arial"/>
+        </w:rPr>
+      </w:pPr>
+    </w:p>
+    <w:p>
+      <w:pPr>
+        <w:spacing w:after="0"/>
+        <w:rPr>
+          <w:rFonts w:ascii="Arial" w:hAnsi="Arial" w:cs="Arial"/>
+        </w:rPr>
+      </w:pPr>
+      <w:r>
+        <w:rPr>
+          <w:rFonts w:ascii="Arial" w:hAnsi="Arial" w:cs="Arial"/>
+        </w:rPr>
+        <w:t>DAO 96-40 enumerates LGU roles in mining governance, including:</w:t>
+      </w:r>
+    </w:p>
+    <w:p>
+      <w:pPr>
+        <w:spacing w:after="0"/>
+        <w:rPr>
+          <w:rFonts w:ascii="Arial" w:hAnsi="Arial" w:cs="Arial"/>
+        </w:rPr>
+      </w:pPr>
+      <w:r>
+        <w:rPr>
+          <w:rFonts w:ascii="Arial" w:hAnsi="Arial" w:cs="Arial"/>
+        </w:rPr>
+        <w:t>- Ensuring compliance with public notice/consultation/participation requirements.</w:t>
+      </w:r>
+    </w:p>
+    <w:p>
+      <w:pPr>
+        <w:spacing w:after="0"/>
+        <w:rPr>
+          <w:rFonts w:ascii="Arial" w:hAnsi="Arial" w:cs="Arial"/>
+        </w:rPr>
+      </w:pPr>
+      <w:r>
+        <w:rPr>
+          <w:rFonts w:ascii="Arial" w:hAnsi="Arial" w:cs="Arial"/>
+        </w:rPr>
+        <w:t>- Approving specified permits in coordination with DENR/MGB and subject to existing mining rights.</w:t>
+      </w:r>
+    </w:p>
+    <w:p>
+      <w:pPr>
+        <w:spacing w:after="0"/>
+        <w:rPr>
+          <w:rFonts w:ascii="Arial" w:hAnsi="Arial" w:cs="Arial"/>
+        </w:rPr>
+      </w:pPr>
+      <w:r>
+        <w:rPr>
+          <w:rFonts w:ascii="Arial" w:hAnsi="Arial" w:cs="Arial"/>
+        </w:rPr>
+        <w:t>- Facilitating the community’s informed decision on social acceptability of mining projects (for ECC-related processes).</w:t>
+      </w:r>
+    </w:p>
+    <w:p>
+      <w:pPr>
+        <w:spacing w:after="0"/>
+        <w:rPr>
+          <w:rFonts w:ascii="Arial" w:hAnsi="Arial" w:cs="Arial"/>
+        </w:rPr>
+      </w:pPr>
+      <w:r>
+        <w:rPr>
+          <w:rFonts w:ascii="Arial" w:hAnsi="Arial" w:cs="Arial"/>
+        </w:rPr>
+        <w:t>- Participation in monitoring mechanisms (e.g., multipartite monitoring) and related committees.</w:t>
+      </w:r>
+    </w:p>
+    <w:p>
+      <w:pPr>
+        <w:spacing w:after="0"/>
+        <w:rPr>
+          <w:rFonts w:ascii="Arial" w:hAnsi="Arial" w:cs="Arial"/>
+        </w:rPr>
+      </w:pPr>
+    </w:p>
+    <w:p>
+      <w:pPr>
+        <w:spacing w:after="0"/>
+        <w:rPr>
+          <w:rFonts w:ascii="Arial" w:hAnsi="Arial" w:cs="Arial"/>
+        </w:rPr>
+      </w:pPr>
+      <w:r>
+        <w:rPr>
+          <w:rFonts w:ascii="Arial" w:hAnsi="Arial" w:cs="Arial"/>
+        </w:rPr>
+        <w:t>---</w:t>
+      </w:r>
+    </w:p>
+    <w:p>
+      <w:pPr>
+        <w:spacing w:after="0"/>
+        <w:rPr>
+          <w:rFonts w:ascii="Arial" w:hAnsi="Arial" w:cs="Arial"/>
+        </w:rPr>
+      </w:pPr>
+    </w:p>
+    <w:p>
+      <w:pPr>
+        <w:spacing w:after="0"/>
+        <w:rPr>
+          <w:rFonts w:ascii="Arial" w:hAnsi="Arial" w:cs="Arial"/>
+        </w:rPr>
+      </w:pPr>
+      <w:r>
+        <w:rPr>
+          <w:rFonts w:ascii="Arial" w:hAnsi="Arial" w:cs="Arial"/>
+        </w:rPr>
+        <w:t>## III. Consultation and Hearings</w:t>
+      </w:r>
+    </w:p>
+    <w:p>
+      <w:pPr>
+        <w:spacing w:after="0"/>
+        <w:rPr>
+          <w:rFonts w:ascii="Arial" w:hAnsi="Arial" w:cs="Arial"/>
+        </w:rPr>
+      </w:pPr>
+    </w:p>
+    <w:p>
+      <w:pPr>
+        <w:spacing w:after="0"/>
+        <w:rPr>
+          <w:rFonts w:ascii="Arial" w:hAnsi="Arial" w:cs="Arial"/>
+        </w:rPr>
+      </w:pPr>
+      <w:r>
+        <w:rPr>
+          <w:rFonts w:ascii="Arial" w:hAnsi="Arial" w:cs="Arial"/>
+        </w:rPr>
+        <w:t>- **Ancestral lands**: RA 7942 provides that ancestral land should not be opened for mining operations without prior consent of the concerned Indigenous Cultural Community.</w:t>
+      </w:r>
+    </w:p>
+    <w:p>
+      <w:pPr>
+        <w:spacing w:after="0"/>
+        <w:rPr>
+          <w:rFonts w:ascii="Arial" w:hAnsi="Arial" w:cs="Arial"/>
+        </w:rPr>
+      </w:pPr>
+      <w:r>
+        <w:rPr>
+          <w:rFonts w:ascii="Arial" w:hAnsi="Arial" w:cs="Arial"/>
+        </w:rPr>
+        <w:t>- **Mineral reservations**: DAO 96-40 provides for public hearings (including LGU participation) for establishment/disestablishment/modification of mineral reservations.</w:t>
+      </w:r>
+    </w:p>
+    <w:p>
+      <w:pPr>
+        <w:spacing w:after="0"/>
+        <w:rPr>
+          <w:rFonts w:ascii="Arial" w:hAnsi="Arial" w:cs="Arial"/>
+        </w:rPr>
+      </w:pPr>
+    </w:p>
+    <w:p>
+      <w:pPr>
+        <w:spacing w:after="0"/>
+        <w:rPr>
+          <w:rFonts w:ascii="Arial" w:hAnsi="Arial" w:cs="Arial"/>
+        </w:rPr>
+      </w:pPr>
+      <w:r>
+        <w:rPr>
+          <w:rFonts w:ascii="Arial" w:hAnsi="Arial" w:cs="Arial"/>
+        </w:rPr>
+        <w:t>---</w:t>
+      </w:r>
+    </w:p>
+    <w:p>
+      <w:pPr>
+        <w:spacing w:after="0"/>
+        <w:rPr>
+          <w:rFonts w:ascii="Arial" w:hAnsi="Arial" w:cs="Arial"/>
+        </w:rPr>
+      </w:pPr>
+    </w:p>
+    <w:p>
+      <w:pPr>
+        <w:spacing w:after="0"/>
+        <w:rPr>
+          <w:rFonts w:ascii="Arial" w:hAnsi="Arial" w:cs="Arial"/>
+        </w:rPr>
+      </w:pPr>
+      <w:r>
+        <w:rPr>
+          <w:rFonts w:ascii="Arial" w:hAnsi="Arial" w:cs="Arial"/>
+        </w:rPr>
+        <w:t>## IV. Financial Benefits and Revenue</w:t>
+      </w:r>
+    </w:p>
+    <w:p>
+      <w:pPr>
+        <w:spacing w:after="0"/>
+        <w:rPr>
+          <w:rFonts w:ascii="Arial" w:hAnsi="Arial" w:cs="Arial"/>
+        </w:rPr>
+      </w:pPr>
+    </w:p>
+    <w:p>
+      <w:pPr>
+        <w:spacing w:after="0"/>
+        <w:rPr>
+          <w:rFonts w:ascii="Arial" w:hAnsi="Arial" w:cs="Arial"/>
+        </w:rPr>
+      </w:pPr>
+      <w:r>
+        <w:rPr>
+          <w:rFonts w:ascii="Arial" w:hAnsi="Arial" w:cs="Arial"/>
+        </w:rPr>
+        <w:t>- RA 7942 provides that the Government share in mineral production sharing agreements is the excise tax on mineral products and is allocated pursuant to the Local Government Code provisions referenced by the Act.</w:t>
+      </w:r>
+    </w:p>
+    <w:p>
+      <w:pPr>
+        <w:spacing w:after="0"/>
+        <w:rPr>
+          <w:rFonts w:ascii="Arial" w:hAnsi="Arial" w:cs="Arial"/>
+        </w:rPr>
+      </w:pPr>
+      <w:r>
+        <w:rPr>
+          <w:rFonts w:ascii="Arial" w:hAnsi="Arial" w:cs="Arial"/>
+        </w:rPr>
+        <w:t>- Quarry permittees pay quarry fees and applicable taxes during the permit term.</w:t>
+      </w:r>
+    </w:p>
+    <w:p>
+      <w:pPr>
+        <w:spacing w:after="0"/>
+        <w:rPr>
+          <w:rFonts w:ascii="Arial" w:hAnsi="Arial" w:cs="Arial"/>
+        </w:rPr>
+      </w:pPr>
+    </w:p>
+    <w:p>
+      <w:pPr>
+        <w:spacing w:after="0"/>
+        <w:rPr>
+          <w:rFonts w:ascii="Arial" w:hAnsi="Arial" w:cs="Arial"/>
+        </w:rPr>
+      </w:pPr>
+      <w:r>
+        <w:rPr>
+          <w:rFonts w:ascii="Arial" w:hAnsi="Arial" w:cs="Arial"/>
+        </w:rPr>
+        <w:t>---</w:t>
+      </w:r>
+    </w:p>
+    <w:p>
+      <w:pPr>
+        <w:spacing w:after="0"/>
+        <w:rPr>
+          <w:rFonts w:ascii="Arial" w:hAnsi="Arial" w:cs="Arial"/>
+        </w:rPr>
+      </w:pPr>
+    </w:p>
+    <w:p>
+      <w:pPr>
+        <w:spacing w:after="0"/>
+        <w:rPr>
+          <w:rFonts w:ascii="Arial" w:hAnsi="Arial" w:cs="Arial"/>
+        </w:rPr>
+      </w:pPr>
+      <w:r>
+        <w:rPr>
+          <w:rFonts w:ascii="Arial" w:hAnsi="Arial" w:cs="Arial"/>
+        </w:rPr>
+        <w:t>## V. LGU Coordination With DENR</w:t>
+      </w:r>
+    </w:p>
+    <w:p>
+      <w:pPr>
+        <w:spacing w:after="0"/>
+        <w:rPr>
+          <w:rFonts w:ascii="Arial" w:hAnsi="Arial" w:cs="Arial"/>
+        </w:rPr>
+      </w:pPr>
+    </w:p>
+    <w:p>
+      <w:pPr>
+        <w:spacing w:after="0"/>
+        <w:rPr>
+          <w:rFonts w:ascii="Arial" w:hAnsi="Arial" w:cs="Arial"/>
+        </w:rPr>
+      </w:pPr>
+      <w:r>
+        <w:rPr>
+          <w:rFonts w:ascii="Arial" w:hAnsi="Arial" w:cs="Arial"/>
+        </w:rPr>
+        <w:t>- Coordinate on environmental compliance, monitoring, and enforcement actions.</w:t>
+      </w:r>
+    </w:p>
+    <w:p>
+      <w:pPr>
+        <w:spacing w:after="0"/>
+        <w:rPr>
+          <w:rFonts w:ascii="Arial" w:hAnsi="Arial" w:cs="Arial"/>
+        </w:rPr>
+      </w:pPr>
+      <w:r>
+        <w:rPr>
+          <w:rFonts w:ascii="Arial" w:hAnsi="Arial" w:cs="Arial"/>
+        </w:rPr>
+        <w:t>- Coordinate on community development, conflict management, and reporting.</w:t>
+      </w:r>
+    </w:p>
+    <w:p>
+      <w:pPr>
+        <w:spacing w:after="0"/>
+        <w:rPr>
+          <w:rFonts w:ascii="Arial" w:hAnsi="Arial" w:cs="Arial"/>
+        </w:rPr>
+      </w:pPr>
+    </w:p>
+    <w:p>
+      <w:pPr>
+        <w:spacing w:after="0"/>
+        <w:rPr>
+          <w:rFonts w:ascii="Arial" w:hAnsi="Arial" w:cs="Arial"/>
+        </w:rPr>
+      </w:pPr>
+      <w:r>
+        <w:rPr>
+          <w:rFonts w:ascii="Arial" w:hAnsi="Arial" w:cs="Arial"/>
+        </w:rPr>
+        <w:t>---</w:t>
+      </w:r>
+    </w:p>
+    <w:p>
+      <w:pPr>
+        <w:spacing w:after="0"/>
+        <w:rPr>
+          <w:rFonts w:ascii="Arial" w:hAnsi="Arial" w:cs="Arial"/>
+        </w:rPr>
+      </w:pPr>
+    </w:p>
+    <w:p>
+      <w:pPr>
+        <w:spacing w:after="0"/>
+        <w:rPr>
+          <w:rFonts w:ascii="Arial" w:hAnsi="Arial" w:cs="Arial"/>
+        </w:rPr>
+      </w:pPr>
+      <w:r>
+        <w:rPr>
+          <w:rFonts w:ascii="Arial" w:hAnsi="Arial" w:cs="Arial"/>
+        </w:rPr>
+        <w:t>## VI. Regulatory Limitations</w:t>
+      </w:r>
+    </w:p>
+    <w:p>
+      <w:pPr>
+        <w:spacing w:after="0"/>
+        <w:rPr>
+          <w:rFonts w:ascii="Arial" w:hAnsi="Arial" w:cs="Arial"/>
+        </w:rPr>
+      </w:pPr>
+    </w:p>
+    <w:p>
+      <w:pPr>
+        <w:spacing w:after="0"/>
+        <w:rPr>
+          <w:rFonts w:ascii="Arial" w:hAnsi="Arial" w:cs="Arial"/>
+        </w:rPr>
+      </w:pPr>
+      <w:r>
+        <w:rPr>
+          <w:rFonts w:ascii="Arial" w:hAnsi="Arial" w:cs="Arial"/>
+        </w:rPr>
+        <w:t>- EO 79 directs that LGUs should confine themselves to imposing reasonable limitations on mining activities consistent with national laws and regulations.</w:t>
+      </w:r>
+    </w:p>
+    <w:p>
+      <w:pPr>
+        <w:spacing w:after="0"/>
+        <w:rPr>
+          <w:rFonts w:ascii="Arial" w:hAnsi="Arial" w:cs="Arial"/>
+        </w:rPr>
+      </w:pPr>
+      <w:r>
+        <w:rPr>
+          <w:rFonts w:ascii="Arial" w:hAnsi="Arial" w:cs="Arial"/>
+        </w:rPr>
+        <w:t xml:space="preserve">- DAO 96-40 defines “built-up areas” by reference to duly approved land use plans by the appropriate </w:t>
+      </w:r>
+      <w:proofErr w:type="spellStart"/>
+      <w:r>
+        <w:rPr>
+          <w:rFonts w:ascii="Arial" w:hAnsi="Arial" w:cs="Arial"/>
+        </w:rPr>
+        <w:t>Sanggunian</w:t>
+      </w:r>
+      <w:proofErr w:type="spellEnd"/>
+      <w:r>
+        <w:rPr>
+          <w:rFonts w:ascii="Arial" w:hAnsi="Arial" w:cs="Arial"/>
+        </w:rPr>
+        <w:t>, affecting where mining can proceed.</w:t>
+      </w:r>
+    </w:p>
+    <w:p>
+      <w:pPr>
+        <w:spacing w:after="0"/>
+        <w:rPr>
+          <w:rFonts w:ascii="Arial" w:hAnsi="Arial" w:cs="Arial"/>
+        </w:rPr>
+      </w:pPr>
+    </w:p>
+    <w:p>
+      <w:pPr>
+        <w:spacing w:after="0"/>
+        <w:rPr>
+          <w:rFonts w:ascii="Arial" w:hAnsi="Arial" w:cs="Arial"/>
+        </w:rPr>
+      </w:pPr>
+      <w:r>
+        <w:rPr>
+          <w:rFonts w:ascii="Arial" w:hAnsi="Arial" w:cs="Arial"/>
+        </w:rPr>
+        <w:t>---</w:t>
+      </w:r>
+    </w:p>
+    <w:p>
+      <w:pPr>
+        <w:spacing w:after="0"/>
+        <w:rPr>
+          <w:rFonts w:ascii="Arial" w:hAnsi="Arial" w:cs="Arial"/>
+        </w:rPr>
+      </w:pPr>
+    </w:p>
+    <w:p>
+      <w:pPr>
+        <w:spacing w:after="0"/>
+        <w:rPr>
+          <w:rFonts w:ascii="Arial" w:hAnsi="Arial" w:cs="Arial"/>
+        </w:rPr>
+      </w:pPr>
+      <w:r>
+        <w:rPr>
+          <w:rFonts w:ascii="Arial" w:hAnsi="Arial" w:cs="Arial"/>
+        </w:rPr>
+        <w:t>## VII. Small-Scale Mining</w:t>
+      </w:r>
+    </w:p>
+    <w:p>
+      <w:pPr>
+        <w:spacing w:after="0"/>
+        <w:rPr>
+          <w:rFonts w:ascii="Arial" w:hAnsi="Arial" w:cs="Arial"/>
+        </w:rPr>
+      </w:pPr>
+    </w:p>
+    <w:p>
+      <w:pPr>
+        <w:spacing w:after="0"/>
+        <w:rPr>
+          <w:rFonts w:ascii="Arial" w:hAnsi="Arial" w:cs="Arial"/>
+        </w:rPr>
+      </w:pPr>
+      <w:r>
+        <w:rPr>
+          <w:rFonts w:ascii="Arial" w:hAnsi="Arial" w:cs="Arial"/>
+        </w:rPr>
+        <w:t>- RA 7942 states small-scale mining remains governed by RA 7076 and other pertinent laws.</w:t>
+      </w:r>
+    </w:p>
+    <w:p>
+      <w:pPr>
+        <w:spacing w:after="0"/>
+        <w:rPr>
+          <w:rFonts w:ascii="Arial" w:hAnsi="Arial" w:cs="Arial"/>
+        </w:rPr>
+      </w:pPr>
+      <w:r>
+        <w:rPr>
+          <w:rFonts w:ascii="Arial" w:hAnsi="Arial" w:cs="Arial"/>
+        </w:rPr>
+        <w:t>- PMRB has roles in transport policies and local governance related to small-scale operations.</w:t>
+      </w:r>
+    </w:p>
+    <w:p>
+      <w:pPr>
+        <w:spacing w:after="0"/>
+        <w:rPr>
+          <w:rFonts w:ascii="Arial" w:hAnsi="Arial" w:cs="Arial"/>
+        </w:rPr>
+      </w:pPr>
+    </w:p>
+    <w:p>
+      <w:pPr>
+        <w:spacing w:after="0"/>
+        <w:rPr>
+          <w:rFonts w:ascii="Arial" w:hAnsi="Arial" w:cs="Arial"/>
+        </w:rPr>
+      </w:pPr>
+      <w:r>
+        <w:rPr>
+          <w:rFonts w:ascii="Arial" w:hAnsi="Arial" w:cs="Arial"/>
+        </w:rPr>
+        <w:t>---</w:t>
+      </w:r>
+    </w:p>
+    <w:p>
+      <w:pPr>
+        <w:spacing w:after="0"/>
+        <w:rPr>
+          <w:rFonts w:ascii="Arial" w:hAnsi="Arial" w:cs="Arial"/>
+        </w:rPr>
+      </w:pPr>
+    </w:p>
+    <w:p>
+      <w:pPr>
+        <w:spacing w:after="0"/>
+        <w:rPr>
+          <w:rFonts w:ascii="Arial" w:hAnsi="Arial" w:cs="Arial"/>
+        </w:rPr>
+      </w:pPr>
+      <w:r>
+        <w:rPr>
+          <w:rFonts w:ascii="Arial" w:hAnsi="Arial" w:cs="Arial"/>
+        </w:rPr>
+        <w:t>## VIII-A. SDMP (DAO 2004-54)</w:t>
+      </w:r>
+    </w:p>
+    <w:p>
+      <w:pPr>
+        <w:spacing w:after="0"/>
+        <w:rPr>
+          <w:rFonts w:ascii="Arial" w:hAnsi="Arial" w:cs="Arial"/>
+        </w:rPr>
+      </w:pPr>
+    </w:p>
+    <w:p>
+      <w:pPr>
+        <w:spacing w:after="0"/>
+        <w:rPr>
+          <w:rFonts w:ascii="Arial" w:hAnsi="Arial" w:cs="Arial"/>
+        </w:rPr>
+      </w:pPr>
+      <w:r>
+        <w:rPr>
+          <w:rFonts w:ascii="Arial" w:hAnsi="Arial" w:cs="Arial"/>
+        </w:rPr>
+        <w:t>DAO 2004-54 amended DAO 96-40 (notably Chapter XIV) and institutionalized the **Social Development and Management Program (SDMP)** framework.</w:t>
+      </w:r>
+    </w:p>
+    <w:p>
+      <w:pPr>
+        <w:spacing w:after="0"/>
+        <w:rPr>
+          <w:rFonts w:ascii="Arial" w:hAnsi="Arial" w:cs="Arial"/>
+        </w:rPr>
+      </w:pPr>
+    </w:p>
+    <w:p>
+      <w:pPr>
+        <w:spacing w:after="0"/>
+        <w:rPr>
+          <w:rFonts w:ascii="Arial" w:hAnsi="Arial" w:cs="Arial"/>
+        </w:rPr>
+      </w:pPr>
+      <w:r>
+        <w:rPr>
+          <w:rFonts w:ascii="Arial" w:hAnsi="Arial" w:cs="Arial"/>
+        </w:rPr>
+        <w:t>### A. SDMP requirement</w:t>
+      </w:r>
+    </w:p>
+    <w:p>
+      <w:pPr>
+        <w:spacing w:after="0"/>
+        <w:rPr>
+          <w:rFonts w:ascii="Arial" w:hAnsi="Arial" w:cs="Arial"/>
+        </w:rPr>
+      </w:pPr>
+    </w:p>
+    <w:p>
+      <w:pPr>
+        <w:spacing w:after="0"/>
+        <w:rPr>
+          <w:rFonts w:ascii="Arial" w:hAnsi="Arial" w:cs="Arial"/>
+        </w:rPr>
+      </w:pPr>
+      <w:r>
+        <w:rPr>
+          <w:rFonts w:ascii="Arial" w:hAnsi="Arial" w:cs="Arial"/>
+        </w:rPr>
+        <w:t>- Contractors/permit holders/lessees must assist in host and neighboring community development **in accordance with an SDMP** approved by the concerned DENR Regional Office.</w:t>
+      </w:r>
+    </w:p>
+    <w:p>
+      <w:pPr>
+        <w:spacing w:after="0"/>
+        <w:rPr>
+          <w:rFonts w:ascii="Arial" w:hAnsi="Arial" w:cs="Arial"/>
+        </w:rPr>
+      </w:pPr>
+    </w:p>
+    <w:p>
+      <w:pPr>
+        <w:spacing w:after="0"/>
+        <w:rPr>
+          <w:rFonts w:ascii="Arial" w:hAnsi="Arial" w:cs="Arial"/>
+        </w:rPr>
+      </w:pPr>
+      <w:r>
+        <w:rPr>
+          <w:rFonts w:ascii="Arial" w:hAnsi="Arial" w:cs="Arial"/>
+        </w:rPr>
+        <w:t>### B. Minimum annual funding (1% rule)</w:t>
+      </w:r>
+    </w:p>
+    <w:p>
+      <w:pPr>
+        <w:spacing w:after="0"/>
+        <w:rPr>
+          <w:rFonts w:ascii="Arial" w:hAnsi="Arial" w:cs="Arial"/>
+        </w:rPr>
+      </w:pPr>
+    </w:p>
+    <w:p>
+      <w:pPr>
+        <w:spacing w:after="0"/>
+        <w:rPr>
+          <w:rFonts w:ascii="Arial" w:hAnsi="Arial" w:cs="Arial"/>
+        </w:rPr>
+      </w:pPr>
+      <w:r>
+        <w:rPr>
+          <w:rFonts w:ascii="Arial" w:hAnsi="Arial" w:cs="Arial"/>
+        </w:rPr>
+        <w:t>- A minimum of **1% of direct mining and milling costs** must be allotted annually to implement:</w:t>
+      </w:r>
+    </w:p>
+    <w:p>
+      <w:pPr>
+        <w:spacing w:after="0"/>
+        <w:rPr>
+          <w:rFonts w:ascii="Arial" w:hAnsi="Arial" w:cs="Arial"/>
+        </w:rPr>
+      </w:pPr>
+      <w:r>
+        <w:rPr>
+          <w:rFonts w:ascii="Arial" w:hAnsi="Arial" w:cs="Arial"/>
+        </w:rPr>
+        <w:t xml:space="preserve">  - **90%** for SDMP (community development), and</w:t>
+      </w:r>
+    </w:p>
+    <w:p>
+      <w:pPr>
+        <w:spacing w:after="0"/>
+        <w:rPr>
+          <w:rFonts w:ascii="Arial" w:hAnsi="Arial" w:cs="Arial"/>
+        </w:rPr>
+      </w:pPr>
+      <w:r>
+        <w:rPr>
+          <w:rFonts w:ascii="Arial" w:hAnsi="Arial" w:cs="Arial"/>
+        </w:rPr>
+        <w:t xml:space="preserve">  - **10%** for public awareness and education on mining and geosciences.</w:t>
+      </w:r>
+    </w:p>
+    <w:p>
+      <w:pPr>
+        <w:spacing w:after="0"/>
+        <w:rPr>
+          <w:rFonts w:ascii="Arial" w:hAnsi="Arial" w:cs="Arial"/>
+        </w:rPr>
+      </w:pPr>
+      <w:r>
+        <w:rPr>
+          <w:rFonts w:ascii="Arial" w:hAnsi="Arial" w:cs="Arial"/>
+        </w:rPr>
+        <w:t>- A sworn statement of direct mining and milling costs must be submitted within **60 days after the end of each calendar year**.</w:t>
+      </w:r>
+    </w:p>
+    <w:p>
+      <w:pPr>
+        <w:spacing w:after="0"/>
+        <w:rPr>
+          <w:rFonts w:ascii="Arial" w:hAnsi="Arial" w:cs="Arial"/>
+        </w:rPr>
+      </w:pPr>
+    </w:p>
+    <w:p>
+      <w:pPr>
+        <w:spacing w:after="0"/>
+        <w:rPr>
+          <w:rFonts w:ascii="Arial" w:hAnsi="Arial" w:cs="Arial"/>
+        </w:rPr>
+      </w:pPr>
+      <w:r>
+        <w:rPr>
+          <w:rFonts w:ascii="Arial" w:hAnsi="Arial" w:cs="Arial"/>
+        </w:rPr>
+        <w:t>### C. Five-year SDMP cycle and Annual SDMP</w:t>
+      </w:r>
+    </w:p>
+    <w:p>
+      <w:pPr>
+        <w:spacing w:after="0"/>
+        <w:rPr>
+          <w:rFonts w:ascii="Arial" w:hAnsi="Arial" w:cs="Arial"/>
+        </w:rPr>
+      </w:pPr>
+    </w:p>
+    <w:p>
+      <w:pPr>
+        <w:spacing w:after="0"/>
+        <w:rPr>
+          <w:rFonts w:ascii="Arial" w:hAnsi="Arial" w:cs="Arial"/>
+        </w:rPr>
+      </w:pPr>
+      <w:r>
+        <w:rPr>
+          <w:rFonts w:ascii="Arial" w:hAnsi="Arial" w:cs="Arial"/>
+        </w:rPr>
+        <w:t>- SDMP must be submitted **every five (5) years** for approval (to respond to changing community needs).</w:t>
+      </w:r>
+    </w:p>
+    <w:p>
+      <w:pPr>
+        <w:spacing w:after="0"/>
+        <w:rPr>
+          <w:rFonts w:ascii="Arial" w:hAnsi="Arial" w:cs="Arial"/>
+        </w:rPr>
+      </w:pPr>
+      <w:r>
+        <w:rPr>
+          <w:rFonts w:ascii="Arial" w:hAnsi="Arial" w:cs="Arial"/>
+        </w:rPr>
+        <w:t>- An **Annual SDMP** must be submitted at least **30 calendar days** before the beginning of every calendar year (copy furnished the Bureau).</w:t>
+      </w:r>
+    </w:p>
+    <w:p>
+      <w:pPr>
+        <w:spacing w:after="0"/>
+        <w:rPr>
+          <w:rFonts w:ascii="Arial" w:hAnsi="Arial" w:cs="Arial"/>
+        </w:rPr>
+      </w:pPr>
+    </w:p>
+    <w:p>
+      <w:pPr>
+        <w:spacing w:after="0"/>
+        <w:rPr>
+          <w:rFonts w:ascii="Arial" w:hAnsi="Arial" w:cs="Arial"/>
+        </w:rPr>
+      </w:pPr>
+      <w:r>
+        <w:rPr>
+          <w:rFonts w:ascii="Arial" w:hAnsi="Arial" w:cs="Arial"/>
+        </w:rPr>
+        <w:t>### D. SDMP processing, LGU copy requirement</w:t>
+      </w:r>
+    </w:p>
+    <w:p>
+      <w:pPr>
+        <w:spacing w:after="0"/>
+        <w:rPr>
+          <w:rFonts w:ascii="Arial" w:hAnsi="Arial" w:cs="Arial"/>
+        </w:rPr>
+      </w:pPr>
+    </w:p>
+    <w:p>
+      <w:pPr>
+        <w:spacing w:after="0"/>
+        <w:rPr>
+          <w:rFonts w:ascii="Arial" w:hAnsi="Arial" w:cs="Arial"/>
+        </w:rPr>
+      </w:pPr>
+      <w:r>
+        <w:rPr>
+          <w:rFonts w:ascii="Arial" w:hAnsi="Arial" w:cs="Arial"/>
+        </w:rPr>
+        <w:t>- SDMP is submitted to the Regional Office (six copies + electronic file) for review and evaluation, including a technical conference.</w:t>
+      </w:r>
+    </w:p>
+    <w:p>
+      <w:pPr>
+        <w:spacing w:after="0"/>
+        <w:rPr>
+          <w:rFonts w:ascii="Arial" w:hAnsi="Arial" w:cs="Arial"/>
+        </w:rPr>
+      </w:pPr>
+      <w:r>
+        <w:rPr>
+          <w:rFonts w:ascii="Arial" w:hAnsi="Arial" w:cs="Arial"/>
+        </w:rPr>
+        <w:t>- The contractor/permit holder/lessee must provide each concerned **LGU** a copy of the approved SDMP **not later than thirty (30) days** before the intended commencement of mining operations or of effecting the SDMP.</w:t>
+      </w:r>
+    </w:p>
+    <w:p>
+      <w:pPr>
+        <w:spacing w:after="0"/>
+        <w:rPr>
+          <w:rFonts w:ascii="Arial" w:hAnsi="Arial" w:cs="Arial"/>
+        </w:rPr>
+      </w:pPr>
+    </w:p>
+    <w:p>
+      <w:pPr>
+        <w:spacing w:after="0"/>
+        <w:rPr>
+          <w:rFonts w:ascii="Arial" w:hAnsi="Arial" w:cs="Arial"/>
+        </w:rPr>
+      </w:pPr>
+      <w:r>
+        <w:rPr>
+          <w:rFonts w:ascii="Arial" w:hAnsi="Arial" w:cs="Arial"/>
+        </w:rPr>
+        <w:lastRenderedPageBreak/>
+        <w:t>### E. Community Relations Officer (CRO)</w:t>
+      </w:r>
+    </w:p>
+    <w:p>
+      <w:pPr>
+        <w:spacing w:after="0"/>
+        <w:rPr>
+          <w:rFonts w:ascii="Arial" w:hAnsi="Arial" w:cs="Arial"/>
+        </w:rPr>
+      </w:pPr>
+    </w:p>
+    <w:p>
+      <w:pPr>
+        <w:spacing w:after="0"/>
+        <w:rPr>
+          <w:rFonts w:ascii="Arial" w:hAnsi="Arial" w:cs="Arial"/>
+        </w:rPr>
+      </w:pPr>
+      <w:r>
+        <w:rPr>
+          <w:rFonts w:ascii="Arial" w:hAnsi="Arial" w:cs="Arial"/>
+        </w:rPr>
+        <w:t>- Contractor/permit holder/lessee must designate a **Community Relations Officer (CRO)** in its mine organization structure to establish linkages with host and neighboring communities in implementing SDMP.</w:t>
+      </w:r>
+    </w:p>
+    <w:p>
+      <w:pPr>
+        <w:spacing w:after="0"/>
+        <w:rPr>
+          <w:rFonts w:ascii="Arial" w:hAnsi="Arial" w:cs="Arial"/>
+        </w:rPr>
+      </w:pPr>
+    </w:p>
+    <w:p>
+      <w:pPr>
+        <w:spacing w:after="0"/>
+        <w:rPr>
+          <w:rFonts w:ascii="Arial" w:hAnsi="Arial" w:cs="Arial"/>
+        </w:rPr>
+      </w:pPr>
+      <w:r>
+        <w:rPr>
+          <w:rFonts w:ascii="Arial" w:hAnsi="Arial" w:cs="Arial"/>
+        </w:rPr>
+        <w:t>### F. Monitoring, audit, and penalties</w:t>
+      </w:r>
+    </w:p>
+    <w:p>
+      <w:pPr>
+        <w:spacing w:after="0"/>
+        <w:rPr>
+          <w:rFonts w:ascii="Arial" w:hAnsi="Arial" w:cs="Arial"/>
+        </w:rPr>
+      </w:pPr>
+    </w:p>
+    <w:p>
+      <w:pPr>
+        <w:spacing w:after="0"/>
+        <w:rPr>
+          <w:rFonts w:ascii="Arial" w:hAnsi="Arial" w:cs="Arial"/>
+        </w:rPr>
+      </w:pPr>
+      <w:r>
+        <w:rPr>
+          <w:rFonts w:ascii="Arial" w:hAnsi="Arial" w:cs="Arial"/>
+        </w:rPr>
+        <w:t>- Regional Office quarterly monitoring reports support annual audit.</w:t>
+      </w:r>
+    </w:p>
+    <w:p>
+      <w:pPr>
+        <w:spacing w:after="0"/>
+        <w:rPr>
+          <w:rFonts w:ascii="Arial" w:hAnsi="Arial" w:cs="Arial"/>
+        </w:rPr>
+      </w:pPr>
+      <w:r>
+        <w:rPr>
+          <w:rFonts w:ascii="Arial" w:hAnsi="Arial" w:cs="Arial"/>
+        </w:rPr>
+        <w:t>- Monthly internal monitoring is jointly done by the CRO and community representatives.</w:t>
+      </w:r>
+    </w:p>
+    <w:p>
+      <w:pPr>
+        <w:spacing w:after="0"/>
+        <w:rPr>
+          <w:rFonts w:ascii="Arial" w:hAnsi="Arial" w:cs="Arial"/>
+        </w:rPr>
+      </w:pPr>
+      <w:r>
+        <w:rPr>
+          <w:rFonts w:ascii="Arial" w:hAnsi="Arial" w:cs="Arial"/>
+        </w:rPr>
+        <w:t>- Operating without an approved SDMP can lead to fines and, for repeated offenses, suspension of mining/milling operations.</w:t>
+      </w:r>
+    </w:p>
+    <w:p>
+      <w:pPr>
+        <w:spacing w:after="0"/>
+        <w:rPr>
+          <w:rFonts w:ascii="Arial" w:hAnsi="Arial" w:cs="Arial"/>
+        </w:rPr>
+      </w:pPr>
+    </w:p>
+    <w:p>
+      <w:pPr>
+        <w:spacing w:after="0"/>
+        <w:rPr>
+          <w:rFonts w:ascii="Arial" w:hAnsi="Arial" w:cs="Arial"/>
+        </w:rPr>
+      </w:pPr>
+      <w:r>
+        <w:rPr>
+          <w:rFonts w:ascii="Arial" w:hAnsi="Arial" w:cs="Arial"/>
+        </w:rPr>
+        <w:t>---</w:t>
+      </w:r>
+    </w:p>
+    <w:p>
+      <w:pPr>
+        <w:spacing w:after="0"/>
+        <w:rPr>
+          <w:rFonts w:ascii="Arial" w:hAnsi="Arial" w:cs="Arial"/>
+        </w:rPr>
+      </w:pPr>
+    </w:p>
+    <w:p>
+      <w:pPr>
+        <w:spacing w:after="0"/>
+        <w:rPr>
+          <w:rFonts w:ascii="Arial" w:hAnsi="Arial" w:cs="Arial"/>
+        </w:rPr>
+      </w:pPr>
+      <w:r>
+        <w:rPr>
+          <w:rFonts w:ascii="Arial" w:hAnsi="Arial" w:cs="Arial"/>
+        </w:rPr>
+        <w:t>## VIII. LGU Role in Social Development</w:t>
+      </w:r>
+    </w:p>
+    <w:p>
+      <w:pPr>
+        <w:spacing w:after="0"/>
+        <w:rPr>
+          <w:rFonts w:ascii="Arial" w:hAnsi="Arial" w:cs="Arial"/>
+        </w:rPr>
+      </w:pPr>
+    </w:p>
+    <w:p>
+      <w:pPr>
+        <w:spacing w:after="0"/>
+        <w:rPr>
+          <w:rFonts w:ascii="Arial" w:hAnsi="Arial" w:cs="Arial"/>
+        </w:rPr>
+      </w:pPr>
+      <w:r>
+        <w:rPr>
+          <w:rFonts w:ascii="Arial" w:hAnsi="Arial" w:cs="Arial"/>
+        </w:rPr>
+        <w:t>### A. Infrastructure turn-over upon cessation (RA 7942 Sec. 61; DAO 2004-54 Sec. 139)</w:t>
+      </w:r>
+    </w:p>
+    <w:p>
+      <w:pPr>
+        <w:spacing w:after="0"/>
+        <w:rPr>
+          <w:rFonts w:ascii="Arial" w:hAnsi="Arial" w:cs="Arial"/>
+        </w:rPr>
+      </w:pPr>
+    </w:p>
+    <w:p>
+      <w:pPr>
+        <w:spacing w:after="0"/>
+        <w:rPr>
+          <w:rFonts w:ascii="Arial" w:hAnsi="Arial" w:cs="Arial"/>
+        </w:rPr>
+      </w:pPr>
+      <w:r>
+        <w:rPr>
+          <w:rFonts w:ascii="Arial" w:hAnsi="Arial" w:cs="Arial"/>
+        </w:rPr>
+        <w:t>- Upon abandonment/cancellation/termination, the contractor/permit holder/lessee has **1 year** to remove improvements deemed no longer socially usable **after consultation with the concerned LGU(s)/community(</w:t>
+      </w:r>
+      <w:proofErr w:type="spellStart"/>
+      <w:r>
+        <w:rPr>
+          <w:rFonts w:ascii="Arial" w:hAnsi="Arial" w:cs="Arial"/>
+        </w:rPr>
+        <w:t>ies</w:t>
+      </w:r>
+      <w:proofErr w:type="spellEnd"/>
+      <w:r>
+        <w:rPr>
+          <w:rFonts w:ascii="Arial" w:hAnsi="Arial" w:cs="Arial"/>
+        </w:rPr>
+        <w:t>)**.</w:t>
+      </w:r>
+    </w:p>
+    <w:p>
+      <w:pPr>
+        <w:spacing w:after="0"/>
+        <w:rPr>
+          <w:rFonts w:ascii="Arial" w:hAnsi="Arial" w:cs="Arial"/>
+        </w:rPr>
+      </w:pPr>
+      <w:r>
+        <w:rPr>
+          <w:rFonts w:ascii="Arial" w:hAnsi="Arial" w:cs="Arial"/>
+        </w:rPr>
+        <w:t>- Otherwise, social infrastructure and facilities are turned over/donated tax-free to proper government authorities to ensure continued maintenance and use by host and neighboring communities.</w:t>
+      </w:r>
+    </w:p>
+    <w:p>
+      <w:pPr>
+        <w:spacing w:after="0"/>
+        <w:rPr>
+          <w:rFonts w:ascii="Arial" w:hAnsi="Arial" w:cs="Arial"/>
+        </w:rPr>
+      </w:pPr>
+    </w:p>
+    <w:p>
+      <w:pPr>
+        <w:spacing w:after="0"/>
+        <w:rPr>
+          <w:rFonts w:ascii="Arial" w:hAnsi="Arial" w:cs="Arial"/>
+        </w:rPr>
+      </w:pPr>
+      <w:r>
+        <w:rPr>
+          <w:rFonts w:ascii="Arial" w:hAnsi="Arial" w:cs="Arial"/>
+        </w:rPr>
+        <w:t>---</w:t>
+      </w:r>
+    </w:p>
+    <w:p>
+      <w:pPr>
+        <w:spacing w:after="0"/>
+        <w:rPr>
+          <w:rFonts w:ascii="Arial" w:hAnsi="Arial" w:cs="Arial"/>
+        </w:rPr>
+      </w:pPr>
+    </w:p>
+    <w:p>
+      <w:pPr>
+        <w:spacing w:after="0"/>
+        <w:rPr>
+          <w:rFonts w:ascii="Arial" w:hAnsi="Arial" w:cs="Arial"/>
+        </w:rPr>
+      </w:pPr>
+      <w:r>
+        <w:rPr>
+          <w:rFonts w:ascii="Arial" w:hAnsi="Arial" w:cs="Arial"/>
+        </w:rPr>
+        <w:t>## IX. Dispute Resolution</w:t>
+      </w:r>
+    </w:p>
+    <w:p>
+      <w:pPr>
+        <w:spacing w:after="0"/>
+        <w:rPr>
+          <w:rFonts w:ascii="Arial" w:hAnsi="Arial" w:cs="Arial"/>
+        </w:rPr>
+      </w:pPr>
+    </w:p>
+    <w:p>
+      <w:pPr>
+        <w:spacing w:after="0"/>
+        <w:rPr>
+          <w:rFonts w:ascii="Arial" w:hAnsi="Arial" w:cs="Arial"/>
+        </w:rPr>
+      </w:pPr>
+      <w:r>
+        <w:rPr>
+          <w:rFonts w:ascii="Arial" w:hAnsi="Arial" w:cs="Arial"/>
+        </w:rPr>
+        <w:t>- RA 7942 establishes a Panel of Arbitrators at the regional level with jurisdiction over mining disputes.</w:t>
+      </w:r>
+    </w:p>
+    <w:p>
+      <w:pPr>
+        <w:spacing w:after="0"/>
+        <w:rPr>
+          <w:rFonts w:ascii="Arial" w:hAnsi="Arial" w:cs="Arial"/>
+        </w:rPr>
+      </w:pPr>
+    </w:p>
+    <w:p>
+      <w:pPr>
+        <w:spacing w:after="0"/>
+        <w:rPr>
+          <w:rFonts w:ascii="Arial" w:hAnsi="Arial" w:cs="Arial"/>
+        </w:rPr>
+      </w:pPr>
+      <w:r>
+        <w:rPr>
+          <w:rFonts w:ascii="Arial" w:hAnsi="Arial" w:cs="Arial"/>
+        </w:rPr>
+        <w:t>---</w:t>
+      </w:r>
+    </w:p>
+    <w:p>
+      <w:pPr>
+        <w:spacing w:after="0"/>
+        <w:rPr>
+          <w:rFonts w:ascii="Arial" w:hAnsi="Arial" w:cs="Arial"/>
+        </w:rPr>
+      </w:pPr>
+    </w:p>
+    <w:p>
+      <w:pPr>
+        <w:spacing w:after="0"/>
+        <w:rPr>
+          <w:rFonts w:ascii="Arial" w:hAnsi="Arial" w:cs="Arial"/>
+        </w:rPr>
+      </w:pPr>
+      <w:r>
+        <w:rPr>
+          <w:rFonts w:ascii="Arial" w:hAnsi="Arial" w:cs="Arial"/>
+        </w:rPr>
+        <w:t>## X. Practical LGU Implementation Notes</w:t>
+      </w:r>
+    </w:p>
+    <w:p>
+      <w:pPr>
+        <w:spacing w:after="0"/>
+        <w:rPr>
+          <w:rFonts w:ascii="Arial" w:hAnsi="Arial" w:cs="Arial"/>
+        </w:rPr>
+      </w:pPr>
+    </w:p>
+    <w:p>
+      <w:pPr>
+        <w:spacing w:after="0"/>
+        <w:rPr>
+          <w:rFonts w:ascii="Arial" w:hAnsi="Arial" w:cs="Arial"/>
+        </w:rPr>
+      </w:pPr>
+      <w:r>
+        <w:rPr>
+          <w:rFonts w:ascii="Arial" w:hAnsi="Arial" w:cs="Arial"/>
+        </w:rPr>
+        <w:t>- Maintain permit records, endorsements, monitoring reports, and revenue tracking.</w:t>
+      </w:r>
+    </w:p>
+    <w:p>
+      <w:pPr>
+        <w:spacing w:after="0"/>
+        <w:rPr>
+          <w:rFonts w:ascii="Arial" w:hAnsi="Arial" w:cs="Arial"/>
+        </w:rPr>
+      </w:pPr>
+      <w:r>
+        <w:rPr>
+          <w:rFonts w:ascii="Arial" w:hAnsi="Arial" w:cs="Arial"/>
+        </w:rPr>
+        <w:t>- Verify no conflict with existing mining rights before issuing permits.</w:t>
+      </w:r>
+    </w:p>
+    <w:p>
+      <w:pPr>
+        <w:spacing w:after="0"/>
+        <w:rPr>
+          <w:rFonts w:ascii="Arial" w:hAnsi="Arial" w:cs="Arial"/>
+        </w:rPr>
+      </w:pPr>
+      <w:r>
+        <w:rPr>
+          <w:rFonts w:ascii="Arial" w:hAnsi="Arial" w:cs="Arial"/>
+        </w:rPr>
+        <w:t>- Coordinate with DENR/MGB on area status, ECC-related requirements, and compliance monitoring.</w:t>
+      </w:r>
+    </w:p>
+    <w:p>
+      <w:pPr>
+        <w:spacing w:after="0"/>
+        <w:rPr>
+          <w:rFonts w:ascii="Arial" w:hAnsi="Arial" w:cs="Arial"/>
+        </w:rPr>
+      </w:pPr>
+    </w:p>
+    <w:p>
+      <w:pPr>
+        <w:spacing w:after="0"/>
+        <w:rPr>
+          <w:rFonts w:ascii="Arial" w:hAnsi="Arial" w:cs="Arial"/>
+        </w:rPr>
+      </w:pPr>
+      <w:r>
+        <w:rPr>
+          <w:rFonts w:ascii="Arial" w:hAnsi="Arial" w:cs="Arial"/>
+        </w:rPr>
+        <w:t>---</w:t>
+      </w:r>
+    </w:p>
+    <w:p>
+      <w:pPr>
+        <w:spacing w:after="0"/>
+        <w:rPr>
+          <w:rFonts w:ascii="Arial" w:hAnsi="Arial" w:cs="Arial"/>
+        </w:rPr>
+      </w:pPr>
+    </w:p>
+    <w:p>
+      <w:pPr>
+        <w:spacing w:after="0"/>
+        <w:rPr>
+          <w:rFonts w:ascii="Arial" w:hAnsi="Arial" w:cs="Arial"/>
+        </w:rPr>
+      </w:pPr>
+      <w:r>
+        <w:rPr>
+          <w:rFonts w:ascii="Arial" w:hAnsi="Arial" w:cs="Arial"/>
+        </w:rPr>
+        <w:t>## XI. Permit Validity Quick Reference</w:t>
+      </w:r>
+    </w:p>
+    <w:p>
+      <w:pPr>
+        <w:spacing w:after="0"/>
+        <w:rPr>
+          <w:rFonts w:ascii="Arial" w:hAnsi="Arial" w:cs="Arial"/>
+        </w:rPr>
+      </w:pPr>
+    </w:p>
+    <w:p>
+      <w:pPr>
+        <w:spacing w:after="0"/>
+        <w:rPr>
+          <w:rFonts w:ascii="Arial" w:hAnsi="Arial" w:cs="Arial"/>
+        </w:rPr>
+      </w:pPr>
+      <w:r>
+        <w:rPr>
+          <w:rFonts w:ascii="Arial" w:hAnsi="Arial" w:cs="Arial"/>
+        </w:rPr>
+        <w:t>| Permit | Validity | Renewable | Issuing Authority |</w:t>
+      </w:r>
+    </w:p>
+    <w:p>
+      <w:pPr>
+        <w:spacing w:after="0"/>
+        <w:rPr>
+          <w:rFonts w:ascii="Arial" w:hAnsi="Arial" w:cs="Arial"/>
+        </w:rPr>
+      </w:pPr>
+      <w:r>
+        <w:rPr>
+          <w:rFonts w:ascii="Arial" w:hAnsi="Arial" w:cs="Arial"/>
+        </w:rPr>
+        <w:t>|---|---:|---|---|</w:t>
+      </w:r>
+    </w:p>
+    <w:p>
+      <w:pPr>
+        <w:spacing w:after="0"/>
+        <w:rPr>
+          <w:rFonts w:ascii="Arial" w:hAnsi="Arial" w:cs="Arial"/>
+        </w:rPr>
+      </w:pPr>
+      <w:r>
+        <w:rPr>
+          <w:rFonts w:ascii="Arial" w:hAnsi="Arial" w:cs="Arial"/>
+        </w:rPr>
+        <w:t>| Quarry Permit | 5 years | Yes (max 25 years total) | Provincial Governor |</w:t>
+      </w:r>
+    </w:p>
+    <w:p>
+      <w:pPr>
+        <w:spacing w:after="0"/>
+        <w:rPr>
+          <w:rFonts w:ascii="Arial" w:hAnsi="Arial" w:cs="Arial"/>
+        </w:rPr>
+      </w:pPr>
+      <w:r>
+        <w:rPr>
+          <w:rFonts w:ascii="Arial" w:hAnsi="Arial" w:cs="Arial"/>
+        </w:rPr>
+        <w:t>| Commercial Sand &amp; Gravel | 1 year | Yes | Provincial Governor |</w:t>
+      </w:r>
+    </w:p>
+    <w:p>
+      <w:pPr>
+        <w:spacing w:after="0"/>
+        <w:rPr>
+          <w:rFonts w:ascii="Arial" w:hAnsi="Arial" w:cs="Arial"/>
+        </w:rPr>
+      </w:pPr>
+      <w:r>
+        <w:rPr>
+          <w:rFonts w:ascii="Arial" w:hAnsi="Arial" w:cs="Arial"/>
+        </w:rPr>
+        <w:t>| Industrial Sand &amp; Gravel (&gt;5 ha) | 5 years | Yes (max 25 years total) | MGB |</w:t>
+      </w:r>
+    </w:p>
+    <w:p>
+      <w:pPr>
+        <w:spacing w:after="0"/>
+        <w:rPr>
+          <w:rFonts w:ascii="Arial" w:hAnsi="Arial" w:cs="Arial"/>
+        </w:rPr>
+      </w:pPr>
+      <w:r>
+        <w:rPr>
+          <w:rFonts w:ascii="Arial" w:hAnsi="Arial" w:cs="Arial"/>
+        </w:rPr>
+        <w:t>| Exclusive Sand &amp; Gravel | 60 days | No | Provincial Governor |</w:t>
+      </w:r>
+    </w:p>
+    <w:p>
+      <w:pPr>
+        <w:spacing w:after="0"/>
+        <w:rPr>
+          <w:rFonts w:ascii="Arial" w:hAnsi="Arial" w:cs="Arial"/>
+        </w:rPr>
+      </w:pPr>
+    </w:p>
+    <w:p>
+      <w:pPr>
+        <w:spacing w:after="0"/>
+        <w:rPr>
+          <w:rFonts w:ascii="Arial" w:hAnsi="Arial" w:cs="Arial"/>
+        </w:rPr>
+      </w:pPr>
+      <w:r>
+        <w:rPr>
+          <w:rFonts w:ascii="Arial" w:hAnsi="Arial" w:cs="Arial"/>
+        </w:rPr>
+        <w:t>---</w:t>
+      </w:r>
+    </w:p>
+    <w:p>
+      <w:pPr>
+        <w:spacing w:after="0"/>
+        <w:rPr>
+          <w:rFonts w:ascii="Arial" w:hAnsi="Arial" w:cs="Arial"/>
+        </w:rPr>
+      </w:pPr>
+    </w:p>
+    <w:p>
+      <w:pPr>
+        <w:spacing w:after="0"/>
+        <w:rPr>
+          <w:rFonts w:ascii="Arial" w:hAnsi="Arial" w:cs="Arial"/>
+        </w:rPr>
+      </w:pPr>
+      <w:r>
+        <w:rPr>
+          <w:rFonts w:ascii="Arial" w:hAnsi="Arial" w:cs="Arial"/>
+        </w:rPr>
+        <w:t>## XII. Reference List (Primary)</w:t>
+      </w:r>
+    </w:p>
+    <w:p>
+      <w:pPr>
+        <w:spacing w:after="0"/>
+        <w:rPr>
+          <w:rFonts w:ascii="Arial" w:hAnsi="Arial" w:cs="Arial"/>
+        </w:rPr>
+      </w:pPr>
+    </w:p>
+    <w:p>
+      <w:pPr>
+        <w:spacing w:after="0"/>
+        <w:rPr>
+          <w:rFonts w:ascii="Arial" w:hAnsi="Arial" w:cs="Arial"/>
+        </w:rPr>
+      </w:pPr>
+      <w:r>
+        <w:rPr>
+          <w:rFonts w:ascii="Arial" w:hAnsi="Arial" w:cs="Arial"/>
+        </w:rPr>
+        <w:t>- Republic Act No. 7942 (Philippine Mining Act of 1995)</w:t>
+      </w:r>
+    </w:p>
+    <w:p>
+      <w:pPr>
+        <w:spacing w:after="0"/>
+        <w:rPr>
+          <w:rFonts w:ascii="Arial" w:hAnsi="Arial" w:cs="Arial"/>
+        </w:rPr>
+      </w:pPr>
+      <w:r>
+        <w:rPr>
+          <w:rFonts w:ascii="Arial" w:hAnsi="Arial" w:cs="Arial"/>
+        </w:rPr>
+        <w:t>- DENR Administrative Order No. 96-40 (Revised IRR of RA 7942), as amended</w:t>
+      </w:r>
+    </w:p>
+    <w:p>
+      <w:pPr>
+        <w:spacing w:after="0"/>
+        <w:rPr>
+          <w:rFonts w:ascii="Arial" w:hAnsi="Arial" w:cs="Arial"/>
+        </w:rPr>
+      </w:pPr>
+      <w:r>
+        <w:rPr>
+          <w:rFonts w:ascii="Arial" w:hAnsi="Arial" w:cs="Arial"/>
+        </w:rPr>
+        <w:lastRenderedPageBreak/>
+        <w:t xml:space="preserve">- **DENR Administrative Order No. 2004-54 (Aug 31, </w:t>
+      </w:r>
+      <w:proofErr w:type="gramStart"/>
+      <w:r>
+        <w:rPr>
+          <w:rFonts w:ascii="Arial" w:hAnsi="Arial" w:cs="Arial"/>
+        </w:rPr>
+        <w:t>2004)*</w:t>
+      </w:r>
+      <w:proofErr w:type="gramEnd"/>
+      <w:r>
+        <w:rPr>
+          <w:rFonts w:ascii="Arial" w:hAnsi="Arial" w:cs="Arial"/>
+        </w:rPr>
+        <w:t>* – Amendments to DAO 96-40 (SDMP framework and related community obligations)</w:t>
+      </w:r>
+    </w:p>
+    <w:p>
+      <w:pPr>
+        <w:spacing w:after="0"/>
+        <w:rPr>
+          <w:rFonts w:ascii="Arial" w:hAnsi="Arial" w:cs="Arial"/>
+        </w:rPr>
+      </w:pPr>
+      <w:r>
+        <w:rPr>
+          <w:rFonts w:ascii="Arial" w:hAnsi="Arial" w:cs="Arial"/>
+        </w:rPr>
+        <w:t>- Executive Order No. 79</w:t>
+      </w:r>
+    </w:p>
+    <w:p>
+      <w:pPr>
+        <w:spacing w:after="0"/>
+        <w:rPr>
+          <w:rFonts w:ascii="Arial" w:hAnsi="Arial" w:cs="Arial"/>
+        </w:rPr>
+      </w:pPr>
+      <w:r>
+        <w:rPr>
+          <w:rFonts w:ascii="Arial" w:hAnsi="Arial" w:cs="Arial"/>
+        </w:rPr>
+        <w:t>- Republic Act No. 7160 (Local Government Code)</w:t>
+      </w:r>
+    </w:p>
+    <w:p>
+      <w:pPr>
+        <w:spacing w:after="0"/>
+        <w:rPr>
+          <w:rFonts w:ascii="Arial" w:hAnsi="Arial" w:cs="Arial"/>
+        </w:rPr>
+      </w:pPr>
+      <w:r>
+        <w:rPr>
+          <w:rFonts w:ascii="Arial" w:hAnsi="Arial" w:cs="Arial"/>
+        </w:rPr>
+        <w:t>- Republic Act No. 7076 (People’s Small-Scale Mining Act)</w:t>
+      </w:r>
+    </w:p>
+    <w:p>
+      <w:pPr>
+        <w:spacing w:after="0"/>
+        <w:rPr>
+          <w:rFonts w:ascii="Arial" w:hAnsi="Arial" w:cs="Arial"/>
+        </w:rPr>
+      </w:pPr>
+    </w:p>
+    <w:p>
+      <w:pPr>
+        <w:spacing w:after="0"/>
+        <w:rPr>
+          <w:rFonts w:ascii="Arial" w:hAnsi="Arial" w:cs="Arial"/>
+        </w:rPr>
+      </w:pPr>
+      <w:r>
+        <w:rPr>
+          <w:rFonts w:ascii="Arial" w:hAnsi="Arial" w:cs="Arial"/>
+        </w:rPr>
+        <w:t>---</w:t>
+      </w:r>
+    </w:p>
+    <w:p>
+      <w:pPr>
+        <w:spacing w:after="0"/>
+        <w:rPr>
+          <w:rFonts w:ascii="Arial" w:hAnsi="Arial" w:cs="Arial"/>
+        </w:rPr>
+      </w:pPr>
+    </w:p>
+    <w:p>
+      <w:pPr>
+        <w:spacing w:after="0"/>
+        <w:rPr>
+          <w:rFonts w:ascii="Arial" w:hAnsi="Arial" w:cs="Arial"/>
+        </w:rPr>
+      </w:pPr>
+      <w:r>
+        <w:rPr>
+          <w:rFonts w:ascii="Arial" w:hAnsi="Arial" w:cs="Arial"/>
+        </w:rPr>
+        <w:t xml:space="preserve">*This document is for reference purposes only and does not replace official legal texts. Always consult current official issuances and legal counsel for specific </w:t>
+      </w:r>
+      <w:proofErr w:type="gramStart"/>
+      <w:r>
+        <w:rPr>
+          <w:rFonts w:ascii="Arial" w:hAnsi="Arial" w:cs="Arial"/>
+        </w:rPr>
+        <w:t>cases.*</w:t>
+      </w:r>
+      <w:proofErr w:type="gramEnd"/>
     </w:p>
     <w:sectPr>
       <w:pgSz w:w="11906" w:h="16838" w:code="9"/>

</xml_diff>